<commit_message>
VOB review: fix print layout and add rendered PDF
Installed libreoffice-writer (was missing, which is why the document
could not be rendered before) and checked all 18 pages:

- Re-rendered both mockups at a narrower layout width so their text is
  legible when scaled to the page
- Widened the Priority column, which was wrapping the header as
  "Priori / ty"
- Balanced the Show/Remove columns in the Provider section
- Callouts no longer split across pages and no longer butt against the
  table above them

Adds the rendered PDF alongside the .docx.

Co-Authored-By: Claude Opus 5 <noreply@anthropic.com>
Claude-Session: https://claude.ai/code/session_01PNTUruuhdwTUgERFXY2jUJ
</commit_message>
<xml_diff>
--- a/vob-review/VOB_Section_Review.docx
+++ b/vob-review/VOB_Section_Review.docx
@@ -405,6 +405,20 @@
         </w:tc>
       </w:tr>
     </w:tbl>
+    <w:p>
+      <w:pPr>
+        <w:spacing w:after="0" w:before="0" w:line="276"/>
+      </w:pPr>
+      <w:r>
+        <w:rPr>
+          <w:rFonts w:ascii="Calibri" w:cs="Calibri" w:eastAsia="Calibri" w:hAnsi="Calibri"/>
+          <w:color w:val="222222"/>
+          <w:sz w:val="12"/>
+          <w:szCs w:val="12"/>
+        </w:rPr>
+        <w:t xml:space="preserve"/>
+      </w:r>
+    </w:p>
     <w:tbl>
       <w:tblPr>
         <w:tblW w:type="dxa" w:w="10080"/>
@@ -416,11 +430,17 @@
           <w:insideH w:val="none"/>
           <w:insideV w:val="none"/>
         </w:tblBorders>
+        <w:tblCellMar>
+          <w:top w:type="dxa" w:w="0"/>
+        </w:tblCellMar>
       </w:tblPr>
       <w:tblGrid>
         <w:gridCol w:w="10080"/>
       </w:tblGrid>
       <w:tr>
+        <w:trPr>
+          <w:cantSplit/>
+        </w:trPr>
         <w:tc>
           <w:tcPr>
             <w:tcW w:type="dxa" w:w="10080"/>
@@ -1203,6 +1223,20 @@
         </w:tc>
       </w:tr>
     </w:tbl>
+    <w:p>
+      <w:pPr>
+        <w:spacing w:after="0" w:before="0" w:line="276"/>
+      </w:pPr>
+      <w:r>
+        <w:rPr>
+          <w:rFonts w:ascii="Calibri" w:cs="Calibri" w:eastAsia="Calibri" w:hAnsi="Calibri"/>
+          <w:color w:val="222222"/>
+          <w:sz w:val="12"/>
+          <w:szCs w:val="12"/>
+        </w:rPr>
+        <w:t xml:space="preserve"/>
+      </w:r>
+    </w:p>
     <w:tbl>
       <w:tblPr>
         <w:tblW w:type="dxa" w:w="10080"/>
@@ -1214,11 +1248,17 @@
           <w:insideH w:val="none"/>
           <w:insideV w:val="none"/>
         </w:tblBorders>
+        <w:tblCellMar>
+          <w:top w:type="dxa" w:w="0"/>
+        </w:tblCellMar>
       </w:tblPr>
       <w:tblGrid>
         <w:gridCol w:w="10080"/>
       </w:tblGrid>
       <w:tr>
+        <w:trPr>
+          <w:cantSplit/>
+        </w:trPr>
         <w:tc>
           <w:tcPr>
             <w:tcW w:type="dxa" w:w="10080"/>
@@ -1303,7 +1343,7 @@
       <w:r>
         <w:drawing>
           <wp:inline distT="0" distB="0" distL="0" distR="0">
-            <wp:extent cx="6286500" cy="3019425"/>
+            <wp:extent cx="6286500" cy="3790950"/>
             <wp:effectExtent t="0" r="0" b="0" l="0"/>
             <wp:docPr id="1" name="" descr="" title=""/>
             <wp:cNvGraphicFramePr>
@@ -1328,7 +1368,7 @@
                   <pic:spPr bwMode="auto">
                     <a:xfrm>
                       <a:off x="0" y="0"/>
-                      <a:ext cx="6286500" cy="3019425"/>
+                      <a:ext cx="6286500" cy="3790950"/>
                     </a:xfrm>
                     <a:prstGeom prst="rect">
                       <a:avLst/>
@@ -2168,6 +2208,20 @@
         </w:tc>
       </w:tr>
     </w:tbl>
+    <w:p>
+      <w:pPr>
+        <w:spacing w:after="0" w:before="0" w:line="276"/>
+      </w:pPr>
+      <w:r>
+        <w:rPr>
+          <w:rFonts w:ascii="Calibri" w:cs="Calibri" w:eastAsia="Calibri" w:hAnsi="Calibri"/>
+          <w:color w:val="222222"/>
+          <w:sz w:val="12"/>
+          <w:szCs w:val="12"/>
+        </w:rPr>
+        <w:t xml:space="preserve"/>
+      </w:r>
+    </w:p>
     <w:tbl>
       <w:tblPr>
         <w:tblW w:type="dxa" w:w="10080"/>
@@ -2179,11 +2233,17 @@
           <w:insideH w:val="none"/>
           <w:insideV w:val="none"/>
         </w:tblBorders>
+        <w:tblCellMar>
+          <w:top w:type="dxa" w:w="0"/>
+        </w:tblCellMar>
       </w:tblPr>
       <w:tblGrid>
         <w:gridCol w:w="10080"/>
       </w:tblGrid>
       <w:tr>
+        <w:trPr>
+          <w:cantSplit/>
+        </w:trPr>
         <w:tc>
           <w:tcPr>
             <w:tcW w:type="dxa" w:w="10080"/>
@@ -2910,7 +2970,7 @@
       <w:r>
         <w:drawing>
           <wp:inline distT="0" distB="0" distL="0" distR="0">
-            <wp:extent cx="6286500" cy="2476500"/>
+            <wp:extent cx="6286500" cy="3124200"/>
             <wp:effectExtent t="0" r="0" b="0" l="0"/>
             <wp:docPr id="1" name="" descr="" title=""/>
             <wp:cNvGraphicFramePr>
@@ -2935,7 +2995,7 @@
                   <pic:spPr bwMode="auto">
                     <a:xfrm>
                       <a:off x="0" y="0"/>
-                      <a:ext cx="6286500" cy="2476500"/>
+                      <a:ext cx="6286500" cy="3124200"/>
                     </a:xfrm>
                     <a:prstGeom prst="rect">
                       <a:avLst/>
@@ -4043,6 +4103,20 @@
         </w:tc>
       </w:tr>
     </w:tbl>
+    <w:p>
+      <w:pPr>
+        <w:spacing w:after="0" w:before="0" w:line="276"/>
+      </w:pPr>
+      <w:r>
+        <w:rPr>
+          <w:rFonts w:ascii="Calibri" w:cs="Calibri" w:eastAsia="Calibri" w:hAnsi="Calibri"/>
+          <w:color w:val="222222"/>
+          <w:sz w:val="12"/>
+          <w:szCs w:val="12"/>
+        </w:rPr>
+        <w:t xml:space="preserve"/>
+      </w:r>
+    </w:p>
     <w:tbl>
       <w:tblPr>
         <w:tblW w:type="dxa" w:w="10080"/>
@@ -4054,11 +4128,17 @@
           <w:insideH w:val="none"/>
           <w:insideV w:val="none"/>
         </w:tblBorders>
+        <w:tblCellMar>
+          <w:top w:type="dxa" w:w="0"/>
+        </w:tblCellMar>
       </w:tblPr>
       <w:tblGrid>
         <w:gridCol w:w="10080"/>
       </w:tblGrid>
       <w:tr>
+        <w:trPr>
+          <w:cantSplit/>
+        </w:trPr>
         <w:tc>
           <w:tcPr>
             <w:tcW w:type="dxa" w:w="10080"/>
@@ -5733,8 +5813,8 @@
         </w:tblBorders>
       </w:tblPr>
       <w:tblGrid>
-        <w:gridCol w:w="3400"/>
-        <w:gridCol w:w="6680"/>
+        <w:gridCol w:w="5040"/>
+        <w:gridCol w:w="5040"/>
       </w:tblGrid>
       <w:tr>
         <w:trPr>
@@ -5742,7 +5822,7 @@
         </w:trPr>
         <w:tc>
           <w:tcPr>
-            <w:tcW w:type="dxa" w:w="3400"/>
+            <w:tcW w:type="dxa" w:w="5040"/>
             <w:shd w:fill="1F3864" w:color="auto" w:val="clear"/>
             <w:tcMar>
               <w:top w:type="dxa" w:w="90"/>
@@ -5771,7 +5851,7 @@
         </w:tc>
         <w:tc>
           <w:tcPr>
-            <w:tcW w:type="dxa" w:w="6680"/>
+            <w:tcW w:type="dxa" w:w="5040"/>
             <w:shd w:fill="1F3864" w:color="auto" w:val="clear"/>
             <w:tcMar>
               <w:top w:type="dxa" w:w="90"/>
@@ -5802,7 +5882,7 @@
       <w:tr>
         <w:tc>
           <w:tcPr>
-            <w:tcW w:type="dxa" w:w="3400"/>
+            <w:tcW w:type="dxa" w:w="5040"/>
             <w:tcMar>
               <w:top w:type="dxa" w:w="90"/>
               <w:left w:type="dxa" w:w="120"/>
@@ -5922,7 +6002,7 @@
         </w:tc>
         <w:tc>
           <w:tcPr>
-            <w:tcW w:type="dxa" w:w="6680"/>
+            <w:tcW w:type="dxa" w:w="5040"/>
             <w:tcMar>
               <w:top w:type="dxa" w:w="90"/>
               <w:left w:type="dxa" w:w="120"/>
@@ -6208,8 +6288,8 @@
       </w:tblPr>
       <w:tblGrid>
         <w:gridCol w:w="700"/>
-        <w:gridCol w:w="6600"/>
-        <w:gridCol w:w="900"/>
+        <w:gridCol w:w="6300"/>
+        <w:gridCol w:w="1200"/>
         <w:gridCol w:w="1880"/>
       </w:tblGrid>
       <w:tr>
@@ -6247,7 +6327,7 @@
         </w:tc>
         <w:tc>
           <w:tcPr>
-            <w:tcW w:type="dxa" w:w="6600"/>
+            <w:tcW w:type="dxa" w:w="6300"/>
             <w:shd w:fill="1F3864" w:color="auto" w:val="clear"/>
             <w:tcMar>
               <w:top w:type="dxa" w:w="90"/>
@@ -6276,7 +6356,7 @@
         </w:tc>
         <w:tc>
           <w:tcPr>
-            <w:tcW w:type="dxa" w:w="900"/>
+            <w:tcW w:type="dxa" w:w="1200"/>
             <w:shd w:fill="1F3864" w:color="auto" w:val="clear"/>
             <w:tcMar>
               <w:top w:type="dxa" w:w="90"/>
@@ -6362,7 +6442,7 @@
         </w:tc>
         <w:tc>
           <w:tcPr>
-            <w:tcW w:type="dxa" w:w="6600"/>
+            <w:tcW w:type="dxa" w:w="6300"/>
             <w:tcMar>
               <w:top w:type="dxa" w:w="90"/>
               <w:left w:type="dxa" w:w="120"/>
@@ -6388,7 +6468,7 @@
         </w:tc>
         <w:tc>
           <w:tcPr>
-            <w:tcW w:type="dxa" w:w="900"/>
+            <w:tcW w:type="dxa" w:w="1200"/>
             <w:tcMar>
               <w:top w:type="dxa" w:w="90"/>
               <w:left w:type="dxa" w:w="120"/>
@@ -6471,7 +6551,7 @@
         </w:tc>
         <w:tc>
           <w:tcPr>
-            <w:tcW w:type="dxa" w:w="6600"/>
+            <w:tcW w:type="dxa" w:w="6300"/>
             <w:shd w:fill="F5F7FA" w:color="auto" w:val="clear"/>
             <w:tcMar>
               <w:top w:type="dxa" w:w="90"/>
@@ -6498,7 +6578,7 @@
         </w:tc>
         <w:tc>
           <w:tcPr>
-            <w:tcW w:type="dxa" w:w="900"/>
+            <w:tcW w:type="dxa" w:w="1200"/>
             <w:shd w:fill="F5F7FA" w:color="auto" w:val="clear"/>
             <w:tcMar>
               <w:top w:type="dxa" w:w="90"/>
@@ -6582,7 +6662,7 @@
         </w:tc>
         <w:tc>
           <w:tcPr>
-            <w:tcW w:type="dxa" w:w="6600"/>
+            <w:tcW w:type="dxa" w:w="6300"/>
             <w:tcMar>
               <w:top w:type="dxa" w:w="90"/>
               <w:left w:type="dxa" w:w="120"/>
@@ -6608,7 +6688,7 @@
         </w:tc>
         <w:tc>
           <w:tcPr>
-            <w:tcW w:type="dxa" w:w="900"/>
+            <w:tcW w:type="dxa" w:w="1200"/>
             <w:tcMar>
               <w:top w:type="dxa" w:w="90"/>
               <w:left w:type="dxa" w:w="120"/>
@@ -6691,7 +6771,7 @@
         </w:tc>
         <w:tc>
           <w:tcPr>
-            <w:tcW w:type="dxa" w:w="6600"/>
+            <w:tcW w:type="dxa" w:w="6300"/>
             <w:shd w:fill="F5F7FA" w:color="auto" w:val="clear"/>
             <w:tcMar>
               <w:top w:type="dxa" w:w="90"/>
@@ -6718,7 +6798,7 @@
         </w:tc>
         <w:tc>
           <w:tcPr>
-            <w:tcW w:type="dxa" w:w="900"/>
+            <w:tcW w:type="dxa" w:w="1200"/>
             <w:shd w:fill="F5F7FA" w:color="auto" w:val="clear"/>
             <w:tcMar>
               <w:top w:type="dxa" w:w="90"/>
@@ -6802,7 +6882,7 @@
         </w:tc>
         <w:tc>
           <w:tcPr>
-            <w:tcW w:type="dxa" w:w="6600"/>
+            <w:tcW w:type="dxa" w:w="6300"/>
             <w:tcMar>
               <w:top w:type="dxa" w:w="90"/>
               <w:left w:type="dxa" w:w="120"/>
@@ -6828,7 +6908,7 @@
         </w:tc>
         <w:tc>
           <w:tcPr>
-            <w:tcW w:type="dxa" w:w="900"/>
+            <w:tcW w:type="dxa" w:w="1200"/>
             <w:tcMar>
               <w:top w:type="dxa" w:w="90"/>
               <w:left w:type="dxa" w:w="120"/>
@@ -6911,7 +6991,7 @@
         </w:tc>
         <w:tc>
           <w:tcPr>
-            <w:tcW w:type="dxa" w:w="6600"/>
+            <w:tcW w:type="dxa" w:w="6300"/>
             <w:shd w:fill="F5F7FA" w:color="auto" w:val="clear"/>
             <w:tcMar>
               <w:top w:type="dxa" w:w="90"/>
@@ -6938,7 +7018,7 @@
         </w:tc>
         <w:tc>
           <w:tcPr>
-            <w:tcW w:type="dxa" w:w="900"/>
+            <w:tcW w:type="dxa" w:w="1200"/>
             <w:shd w:fill="F5F7FA" w:color="auto" w:val="clear"/>
             <w:tcMar>
               <w:top w:type="dxa" w:w="90"/>
@@ -7022,7 +7102,7 @@
         </w:tc>
         <w:tc>
           <w:tcPr>
-            <w:tcW w:type="dxa" w:w="6600"/>
+            <w:tcW w:type="dxa" w:w="6300"/>
             <w:tcMar>
               <w:top w:type="dxa" w:w="90"/>
               <w:left w:type="dxa" w:w="120"/>
@@ -7048,7 +7128,7 @@
         </w:tc>
         <w:tc>
           <w:tcPr>
-            <w:tcW w:type="dxa" w:w="900"/>
+            <w:tcW w:type="dxa" w:w="1200"/>
             <w:tcMar>
               <w:top w:type="dxa" w:w="90"/>
               <w:left w:type="dxa" w:w="120"/>
@@ -7131,7 +7211,7 @@
         </w:tc>
         <w:tc>
           <w:tcPr>
-            <w:tcW w:type="dxa" w:w="6600"/>
+            <w:tcW w:type="dxa" w:w="6300"/>
             <w:shd w:fill="F5F7FA" w:color="auto" w:val="clear"/>
             <w:tcMar>
               <w:top w:type="dxa" w:w="90"/>
@@ -7158,7 +7238,7 @@
         </w:tc>
         <w:tc>
           <w:tcPr>
-            <w:tcW w:type="dxa" w:w="900"/>
+            <w:tcW w:type="dxa" w:w="1200"/>
             <w:shd w:fill="F5F7FA" w:color="auto" w:val="clear"/>
             <w:tcMar>
               <w:top w:type="dxa" w:w="90"/>
@@ -7242,7 +7322,7 @@
         </w:tc>
         <w:tc>
           <w:tcPr>
-            <w:tcW w:type="dxa" w:w="6600"/>
+            <w:tcW w:type="dxa" w:w="6300"/>
             <w:tcMar>
               <w:top w:type="dxa" w:w="90"/>
               <w:left w:type="dxa" w:w="120"/>
@@ -7268,7 +7348,7 @@
         </w:tc>
         <w:tc>
           <w:tcPr>
-            <w:tcW w:type="dxa" w:w="900"/>
+            <w:tcW w:type="dxa" w:w="1200"/>
             <w:tcMar>
               <w:top w:type="dxa" w:w="90"/>
               <w:left w:type="dxa" w:w="120"/>
@@ -7351,7 +7431,7 @@
         </w:tc>
         <w:tc>
           <w:tcPr>
-            <w:tcW w:type="dxa" w:w="6600"/>
+            <w:tcW w:type="dxa" w:w="6300"/>
             <w:shd w:fill="F5F7FA" w:color="auto" w:val="clear"/>
             <w:tcMar>
               <w:top w:type="dxa" w:w="90"/>
@@ -7378,7 +7458,7 @@
         </w:tc>
         <w:tc>
           <w:tcPr>
-            <w:tcW w:type="dxa" w:w="900"/>
+            <w:tcW w:type="dxa" w:w="1200"/>
             <w:shd w:fill="F5F7FA" w:color="auto" w:val="clear"/>
             <w:tcMar>
               <w:top w:type="dxa" w:w="90"/>
@@ -7462,7 +7542,7 @@
         </w:tc>
         <w:tc>
           <w:tcPr>
-            <w:tcW w:type="dxa" w:w="6600"/>
+            <w:tcW w:type="dxa" w:w="6300"/>
             <w:tcMar>
               <w:top w:type="dxa" w:w="90"/>
               <w:left w:type="dxa" w:w="120"/>
@@ -7488,7 +7568,7 @@
         </w:tc>
         <w:tc>
           <w:tcPr>
-            <w:tcW w:type="dxa" w:w="900"/>
+            <w:tcW w:type="dxa" w:w="1200"/>
             <w:tcMar>
               <w:top w:type="dxa" w:w="90"/>
               <w:left w:type="dxa" w:w="120"/>
@@ -7571,7 +7651,7 @@
         </w:tc>
         <w:tc>
           <w:tcPr>
-            <w:tcW w:type="dxa" w:w="6600"/>
+            <w:tcW w:type="dxa" w:w="6300"/>
             <w:shd w:fill="F5F7FA" w:color="auto" w:val="clear"/>
             <w:tcMar>
               <w:top w:type="dxa" w:w="90"/>
@@ -7598,7 +7678,7 @@
         </w:tc>
         <w:tc>
           <w:tcPr>
-            <w:tcW w:type="dxa" w:w="900"/>
+            <w:tcW w:type="dxa" w:w="1200"/>
             <w:shd w:fill="F5F7FA" w:color="auto" w:val="clear"/>
             <w:tcMar>
               <w:top w:type="dxa" w:w="90"/>
@@ -7682,7 +7762,7 @@
         </w:tc>
         <w:tc>
           <w:tcPr>
-            <w:tcW w:type="dxa" w:w="6600"/>
+            <w:tcW w:type="dxa" w:w="6300"/>
             <w:tcMar>
               <w:top w:type="dxa" w:w="90"/>
               <w:left w:type="dxa" w:w="120"/>
@@ -7708,7 +7788,7 @@
         </w:tc>
         <w:tc>
           <w:tcPr>
-            <w:tcW w:type="dxa" w:w="900"/>
+            <w:tcW w:type="dxa" w:w="1200"/>
             <w:tcMar>
               <w:top w:type="dxa" w:w="90"/>
               <w:left w:type="dxa" w:w="120"/>
@@ -7791,7 +7871,7 @@
         </w:tc>
         <w:tc>
           <w:tcPr>
-            <w:tcW w:type="dxa" w:w="6600"/>
+            <w:tcW w:type="dxa" w:w="6300"/>
             <w:shd w:fill="F5F7FA" w:color="auto" w:val="clear"/>
             <w:tcMar>
               <w:top w:type="dxa" w:w="90"/>
@@ -7818,7 +7898,7 @@
         </w:tc>
         <w:tc>
           <w:tcPr>
-            <w:tcW w:type="dxa" w:w="900"/>
+            <w:tcW w:type="dxa" w:w="1200"/>
             <w:shd w:fill="F5F7FA" w:color="auto" w:val="clear"/>
             <w:tcMar>
               <w:top w:type="dxa" w:w="90"/>
@@ -7902,7 +7982,7 @@
         </w:tc>
         <w:tc>
           <w:tcPr>
-            <w:tcW w:type="dxa" w:w="6600"/>
+            <w:tcW w:type="dxa" w:w="6300"/>
             <w:tcMar>
               <w:top w:type="dxa" w:w="90"/>
               <w:left w:type="dxa" w:w="120"/>
@@ -7928,7 +8008,7 @@
         </w:tc>
         <w:tc>
           <w:tcPr>
-            <w:tcW w:type="dxa" w:w="900"/>
+            <w:tcW w:type="dxa" w:w="1200"/>
             <w:tcMar>
               <w:top w:type="dxa" w:w="90"/>
               <w:left w:type="dxa" w:w="120"/>
@@ -8011,7 +8091,7 @@
         </w:tc>
         <w:tc>
           <w:tcPr>
-            <w:tcW w:type="dxa" w:w="6600"/>
+            <w:tcW w:type="dxa" w:w="6300"/>
             <w:shd w:fill="F5F7FA" w:color="auto" w:val="clear"/>
             <w:tcMar>
               <w:top w:type="dxa" w:w="90"/>
@@ -8038,7 +8118,7 @@
         </w:tc>
         <w:tc>
           <w:tcPr>
-            <w:tcW w:type="dxa" w:w="900"/>
+            <w:tcW w:type="dxa" w:w="1200"/>
             <w:shd w:fill="F5F7FA" w:color="auto" w:val="clear"/>
             <w:tcMar>
               <w:top w:type="dxa" w:w="90"/>
@@ -8122,7 +8202,7 @@
         </w:tc>
         <w:tc>
           <w:tcPr>
-            <w:tcW w:type="dxa" w:w="6600"/>
+            <w:tcW w:type="dxa" w:w="6300"/>
             <w:tcMar>
               <w:top w:type="dxa" w:w="90"/>
               <w:left w:type="dxa" w:w="120"/>
@@ -8148,7 +8228,7 @@
         </w:tc>
         <w:tc>
           <w:tcPr>
-            <w:tcW w:type="dxa" w:w="900"/>
+            <w:tcW w:type="dxa" w:w="1200"/>
             <w:tcMar>
               <w:top w:type="dxa" w:w="90"/>
               <w:left w:type="dxa" w:w="120"/>
@@ -8231,7 +8311,7 @@
         </w:tc>
         <w:tc>
           <w:tcPr>
-            <w:tcW w:type="dxa" w:w="6600"/>
+            <w:tcW w:type="dxa" w:w="6300"/>
             <w:shd w:fill="F5F7FA" w:color="auto" w:val="clear"/>
             <w:tcMar>
               <w:top w:type="dxa" w:w="90"/>
@@ -8258,7 +8338,7 @@
         </w:tc>
         <w:tc>
           <w:tcPr>
-            <w:tcW w:type="dxa" w:w="900"/>
+            <w:tcW w:type="dxa" w:w="1200"/>
             <w:shd w:fill="F5F7FA" w:color="auto" w:val="clear"/>
             <w:tcMar>
               <w:top w:type="dxa" w:w="90"/>

</xml_diff>